<commit_message>
Lay-reader pass, module 03 (TASKS 20): matrix vs gas phase, the rank test and Holm correction, cm-1 explained in README, notebook and report; glossary linked; notebook and report rebuilt
Co-Authored-By: Claude Fable 5.1 <noreply@anthropic.com>
</commit_message>
<xml_diff>
--- a/plans/05_delta-probed-ir-pipeline/modules/03_lab_scoreboard/module_summary.docx
+++ b/plans/05_delta-probed-ir-pipeline/modules/03_lab_scoreboard/module_summary.docx
@@ -194,6 +194,15 @@
           <w:i w:val="0"/>
         </w:rPr>
         <w:t>I analysed laboratory infrared band positions of polycyclic aromatic hydrocarbons (PAHs) measured in two ways: frozen in an argon matrix at 10 K and as a hot vapour. The dataset combines the NASA Ames PAH IR Spectroscopic Database's experimental library, version 3.10 (https://www.astrochemistry.org/pahdb/experimental/3.10; Mattioda et al., 2020), with gas-phase records of the NIST Chemistry WebBook (https://webbook.nist.gov/chemistry/; Linstrom, 1997). The question, fixed in a pre-registration note before any band was paired, is whether the offset between a band's matrix position and its gas-phase position is zero per band family; the answer matters because my larger capstone project will later be scored against exactly these laboratory numbers.</w:t>
+      </w:r>
+    </w:p>
+    <w:p>
+      <w:r>
+        <w:rPr>
+          <w:b w:val="0"/>
+          <w:i w:val="0"/>
+        </w:rPr>
+        <w:t>For a reader without chemistry: a molecule's infrared spectrum is the list of colours at which it absorbs infrared light (its band positions, given in the unit cm⁻¹) and how strongly. Laboratories measure such spectra in two ways: with the molecules frozen into solid argon at 10 K, which is precise but can shift the positions slightly, or as a hot vapour, which is closer to the conditions in space but blurrier. This report asks, for each kind of vibration, whether the two agree. The test used is a rank test that asks whether the differences are centred on zero without assuming a bell-shaped distribution, with a correction for asking the question six times at once. A one-page glossary accompanies the modules (GLOSSARY.md in the repository).</w:t>
       </w:r>
     </w:p>
     <w:p>

</xml_diff>